<commit_message>
feat: add DOCX and XLSX task packages
</commit_message>
<xml_diff>
--- a/tasks/docx/forte-legal-020-power-of-attorney-risk-report/solution/授权委托书风险提示报告.docx
+++ b/tasks/docx/forte-legal-020-power-of-attorney-risk-report/solution/授权委托书风险提示报告.docx
@@ -2043,7 +2043,7 @@
       <w:pPr>
         <w:pStyle w:val="Heading1"/>
         <w:keepNext/>
-        <w:pageBreakBefore/>
+        <w:pageBreakBefore w:val="0"/>
       </w:pPr>
       <w:r>
         <w:t>委托书1｜张伟 → 李芳</w:t>
@@ -2849,7 +2849,7 @@
       <w:pPr>
         <w:pStyle w:val="Heading1"/>
         <w:keepNext/>
-        <w:pageBreakBefore/>
+        <w:pageBreakBefore w:val="0"/>
       </w:pPr>
       <w:r>
         <w:t>委托书2｜陈雪梅 → 王建国律师</w:t>
@@ -3655,7 +3655,7 @@
       <w:pPr>
         <w:pStyle w:val="Heading1"/>
         <w:keepNext/>
-        <w:pageBreakBefore/>
+        <w:pageBreakBefore w:val="0"/>
       </w:pPr>
       <w:r>
         <w:t>委托书3｜刘洋 → 赵明辉</w:t>
@@ -4461,7 +4461,7 @@
       <w:pPr>
         <w:pStyle w:val="Heading1"/>
         <w:keepNext/>
-        <w:pageBreakBefore/>
+        <w:pageBreakBefore w:val="0"/>
       </w:pPr>
       <w:r>
         <w:t>委托书4｜周丽华 → 孙志强律师</w:t>
@@ -5385,7 +5385,7 @@
       <w:pPr>
         <w:pStyle w:val="Heading1"/>
         <w:keepNext/>
-        <w:pageBreakBefore/>
+        <w:pageBreakBefore w:val="0"/>
       </w:pPr>
       <w:r>
         <w:t>委托书5｜吴强 → 黄丽萍</w:t>
@@ -6309,7 +6309,7 @@
       <w:pPr>
         <w:pStyle w:val="Heading1"/>
         <w:keepNext/>
-        <w:pageBreakBefore/>
+        <w:pageBreakBefore w:val="0"/>
       </w:pPr>
       <w:r>
         <w:t>委托书6｜上海盛宏贸易有限公司 → 陈明律师</w:t>

</xml_diff>